<commit_message>
Update regels wrt GoPro
</commit_message>
<xml_diff>
--- a/Regels Risk Eindhoven.docx
+++ b/Regels Risk Eindhoven.docx
@@ -28,6 +28,9 @@
         <w:t>Gedurende het hele spel functioneert een team alsof het één speler is.</w:t>
       </w:r>
       <w:r>
+        <w:rPr>
+          <w:noProof/>
+        </w:rPr>
         <w:drawing>
           <wp:anchor distT="0" distB="0" distL="114300" distR="114300" simplePos="0" relativeHeight="251658240" behindDoc="0" locked="0" layoutInCell="1" allowOverlap="1" wp14:anchorId="5F231110" wp14:editId="4B467801">
             <wp:simplePos x="0" y="0"/>
@@ -165,6 +168,7 @@
       <w:r>
         <w:rPr>
           <w:rFonts w:ascii="Arial" w:hAnsi="Arial" w:cs="Arial"/>
+          <w:noProof/>
           <w:color w:val="000000"/>
           <w:sz w:val="40"/>
           <w:szCs w:val="40"/>
@@ -247,19 +251,19 @@
           <w:rPr>
             <w:rStyle w:val="Hyperlink"/>
           </w:rPr>
-          <w:t>https://map</w:t>
+          <w:t>https://maps</w:t>
         </w:r>
         <w:r>
           <w:rPr>
             <w:rStyle w:val="Hyperlink"/>
           </w:rPr>
-          <w:t>s</w:t>
+          <w:t>.</w:t>
         </w:r>
         <w:r>
           <w:rPr>
             <w:rStyle w:val="Hyperlink"/>
           </w:rPr>
-          <w:t>.app.goo.gl/oNTCDjecYSeowaM7A</w:t>
+          <w:t>app.goo.gl/oNTCDjecYSeowaM7A</w:t>
         </w:r>
       </w:hyperlink>
       <w:r>
@@ -290,7 +294,19 @@
       </w:r>
       <w:proofErr w:type="spellEnd"/>
       <w:r>
-        <w:t xml:space="preserve"> moet je geld uitgeven. Ik schat in dat het om maximaal €10 p.p. gaat over het hele spel heen. Het kan iets meer of iets minder zijn.</w:t>
+        <w:t xml:space="preserve"> moet je geld uitgeven. </w:t>
+      </w:r>
+      <w:r>
+        <w:t xml:space="preserve">Naar </w:t>
+      </w:r>
+      <w:r>
+        <w:t>schat</w:t>
+      </w:r>
+      <w:r>
+        <w:t>ting gaat het</w:t>
+      </w:r>
+      <w:r>
+        <w:t xml:space="preserve"> om maximaal €10 p.p. over het hele spel heen. Het kan iets meer of iets minder zijn.</w:t>
       </w:r>
     </w:p>
     <w:p>
@@ -335,7 +351,19 @@
         </w:numPr>
       </w:pPr>
       <w:r>
-        <w:t>Maak een foto van iemand die ik ken (die niks met het spel te maken heeft). Je mag niet aanbellen bij een huis hiervoor</w:t>
+        <w:t xml:space="preserve">Maak een foto van iemand die </w:t>
+      </w:r>
+      <w:r>
+        <w:t>de host</w:t>
+      </w:r>
+      <w:r>
+        <w:t xml:space="preserve"> ken</w:t>
+      </w:r>
+      <w:r>
+        <w:t>t</w:t>
+      </w:r>
+      <w:r>
+        <w:t xml:space="preserve"> (die niks met het spel te maken heeft)</w:t>
       </w:r>
     </w:p>
     <w:p>
@@ -359,54 +387,40 @@
         </w:numPr>
       </w:pPr>
       <w:r>
-        <w:rPr>
-          <w:rFonts w:ascii="Aptos Narrow" w:eastAsia="Times New Roman" w:hAnsi="Aptos Narrow" w:cs="Times New Roman"/>
-          <w:color w:val="000000"/>
-          <w:kern w:val="0"/>
-          <w:lang w:eastAsia="en-NL"/>
-          <w14:ligatures w14:val="none"/>
-        </w:rPr>
         <w:t>Maak een foto met een ander team</w:t>
       </w:r>
       <w:r>
-        <w:rPr>
-          <w:rFonts w:ascii="Aptos Narrow" w:eastAsia="Times New Roman" w:hAnsi="Aptos Narrow" w:cs="Times New Roman"/>
-          <w:color w:val="000000"/>
-          <w:kern w:val="0"/>
-          <w:lang w:eastAsia="en-NL"/>
-          <w14:ligatures w14:val="none"/>
-        </w:rPr>
-        <w:t xml:space="preserve"> dat niet de tikker is</w:t>
-      </w:r>
-      <w:r>
-        <w:rPr>
-          <w:rFonts w:ascii="Aptos Narrow" w:eastAsia="Times New Roman" w:hAnsi="Aptos Narrow" w:cs="Times New Roman"/>
-          <w:color w:val="000000"/>
-          <w:kern w:val="0"/>
-          <w:lang w:eastAsia="en-NL"/>
-          <w14:ligatures w14:val="none"/>
-        </w:rPr>
+        <w:t>,</w:t>
+      </w:r>
+      <w:r>
+        <w:t xml:space="preserve"> </w:t>
+      </w:r>
+      <w:r>
+        <w:t>wie</w:t>
+      </w:r>
+      <w:r>
+        <w:t xml:space="preserve"> niet </w:t>
+      </w:r>
+      <w:r>
+        <w:t xml:space="preserve">de </w:t>
+      </w:r>
+      <w:r>
+        <w:t>tikker</w:t>
+      </w:r>
+      <w:r>
+        <w:t>s zijn</w:t>
+      </w:r>
+      <w:r>
         <w:t>, na</w:t>
       </w:r>
       <w:r>
-        <w:rPr>
-          <w:rFonts w:ascii="Aptos Narrow" w:eastAsia="Times New Roman" w:hAnsi="Aptos Narrow" w:cs="Times New Roman"/>
-          <w:color w:val="000000"/>
-          <w:kern w:val="0"/>
-          <w:lang w:eastAsia="en-NL"/>
-          <w14:ligatures w14:val="none"/>
-        </w:rPr>
         <w:t xml:space="preserve"> minimaal</w:t>
       </w:r>
       <w:r>
-        <w:rPr>
-          <w:rFonts w:ascii="Aptos Narrow" w:eastAsia="Times New Roman" w:hAnsi="Aptos Narrow" w:cs="Times New Roman"/>
-          <w:color w:val="000000"/>
-          <w:kern w:val="0"/>
-          <w:lang w:eastAsia="en-NL"/>
-          <w14:ligatures w14:val="none"/>
-        </w:rPr>
         <w:t xml:space="preserve"> 1 uur spelen</w:t>
+      </w:r>
+      <w:r>
+        <w:t xml:space="preserve"> (alleen toevallig tegenkomen telt, niet van tevoren afspreken)</w:t>
       </w:r>
     </w:p>
     <w:p>
@@ -429,7 +443,10 @@
         <w:jc w:val="both"/>
       </w:pPr>
       <w:r>
-        <w:t>De host heeft altijd gelijk.</w:t>
+        <w:t>De host heeft altijd gelijk</w:t>
+      </w:r>
+      <w:r>
+        <w:t>!</w:t>
       </w:r>
     </w:p>
     <w:p>
@@ -505,9 +522,15 @@
         </w:numPr>
         <w:ind w:left="709"/>
         <w:jc w:val="both"/>
-      </w:pPr>
-      <w:r>
-        <w:t>Als er sprake is van een achtervolging om te tikken, mogen van beide teams de spelers niet verder dan 10 meter van elkaar verwijderd raken. (Ik weet niet of dit gaat werken, we gaan het merken).</w:t>
+        <w:rPr>
+          <w:highlight w:val="yellow"/>
+        </w:rPr>
+      </w:pPr>
+      <w:r>
+        <w:rPr>
+          <w:highlight w:val="yellow"/>
+        </w:rPr>
+        <w:t>De tikker heeft altijd de GoPro bij zich. Geef dus door als je iemand getikt hebt.</w:t>
       </w:r>
     </w:p>
     <w:p>
@@ -521,23 +544,7 @@
         <w:jc w:val="both"/>
       </w:pPr>
       <w:r>
-        <w:t xml:space="preserve">Het voltooien van een </w:t>
-      </w:r>
-      <w:proofErr w:type="spellStart"/>
-      <w:r>
-        <w:t>challenge</w:t>
-      </w:r>
-      <w:proofErr w:type="spellEnd"/>
-      <w:r>
-        <w:t xml:space="preserve"> wordt gepauzeerd als je wegloopt van de exacte locatie binnen het gebied. (Behalve als je voor de </w:t>
-      </w:r>
-      <w:proofErr w:type="spellStart"/>
-      <w:r>
-        <w:t>challenge</w:t>
-      </w:r>
-      <w:proofErr w:type="spellEnd"/>
-      <w:r>
-        <w:t xml:space="preserve"> moet bewegen).</w:t>
+        <w:t>Als er sprake is van een achtervolging om te tikken, mogen van beide teams de spelers niet verder dan 10 meter van elkaar verwijderd raken. (Ik weet niet of dit gaat werken, we gaan het merken).</w:t>
       </w:r>
     </w:p>
     <w:p>
@@ -551,7 +558,7 @@
         <w:jc w:val="both"/>
       </w:pPr>
       <w:r>
-        <w:t xml:space="preserve">Je mag een </w:t>
+        <w:t xml:space="preserve">Het voltooien van een </w:t>
       </w:r>
       <w:proofErr w:type="spellStart"/>
       <w:r>
@@ -559,15 +566,7 @@
       </w:r>
       <w:proofErr w:type="spellEnd"/>
       <w:r>
-        <w:t xml:space="preserve"> pauzeren en </w:t>
-      </w:r>
-      <w:proofErr w:type="gramStart"/>
-      <w:r>
-        <w:t>weer hervatten</w:t>
-      </w:r>
-      <w:proofErr w:type="gramEnd"/>
-      <w:r>
-        <w:t xml:space="preserve">. Maar zodra je uit een gebied gaat wordt de </w:t>
+        <w:t xml:space="preserve"> wordt gepauzeerd als je wegloopt van de exacte locatie binnen het gebied. (Behalve als je voor de </w:t>
       </w:r>
       <w:proofErr w:type="spellStart"/>
       <w:r>
@@ -575,7 +574,7 @@
       </w:r>
       <w:proofErr w:type="spellEnd"/>
       <w:r>
-        <w:t xml:space="preserve"> afgebroken.</w:t>
+        <w:t xml:space="preserve"> moet bewegen).</w:t>
       </w:r>
     </w:p>
     <w:p>
@@ -589,7 +588,29 @@
         <w:jc w:val="both"/>
       </w:pPr>
       <w:r>
-        <w:t>Regel/wet overtreden is 15 minuten straf (je mag niet bewegen, maar wel getikt worden). De host beoordeelt of je een wet hebt overtreden.</w:t>
+        <w:t xml:space="preserve">Je mag een </w:t>
+      </w:r>
+      <w:proofErr w:type="spellStart"/>
+      <w:r>
+        <w:t>challenge</w:t>
+      </w:r>
+      <w:proofErr w:type="spellEnd"/>
+      <w:r>
+        <w:t xml:space="preserve"> pauzeren en </w:t>
+      </w:r>
+      <w:r>
+        <w:t>hervatten</w:t>
+      </w:r>
+      <w:r>
+        <w:t xml:space="preserve">. Maar zodra je uit een gebied gaat wordt de </w:t>
+      </w:r>
+      <w:proofErr w:type="spellStart"/>
+      <w:r>
+        <w:t>challenge</w:t>
+      </w:r>
+      <w:proofErr w:type="spellEnd"/>
+      <w:r>
+        <w:t xml:space="preserve"> afgebroken.</w:t>
       </w:r>
     </w:p>
     <w:p>
@@ -603,6 +624,20 @@
         <w:jc w:val="both"/>
       </w:pPr>
       <w:r>
+        <w:t>Regel/wet overtreden is 15 minuten straf (je mag niet bewegen, maar wel getikt worden). De host beoordeelt of je een wet hebt overtreden.</w:t>
+      </w:r>
+    </w:p>
+    <w:p>
+      <w:pPr>
+        <w:pStyle w:val="ListParagraph"/>
+        <w:numPr>
+          <w:ilvl w:val="0"/>
+          <w:numId w:val="12"/>
+        </w:numPr>
+        <w:ind w:left="709"/>
+        <w:jc w:val="both"/>
+      </w:pPr>
+      <w:r>
         <w:t xml:space="preserve">Als je voor de tweede keer een gebied wil claimen, kan het zijn dat </w:t>
       </w:r>
       <w:proofErr w:type="spellStart"/>
@@ -660,6 +695,7 @@
           <w:b/>
           <w:bCs/>
         </w:rPr>
+        <w:lastRenderedPageBreak/>
         <w:t>Nodig:</w:t>
       </w:r>
     </w:p>
@@ -673,7 +709,6 @@
         <w:jc w:val="both"/>
       </w:pPr>
       <w:r>
-        <w:lastRenderedPageBreak/>
         <w:t>Internet en Whatsapp om je locatie te delen</w:t>
       </w:r>
     </w:p>
@@ -2778,6 +2813,7 @@
   <w:style w:type="character" w:default="1" w:styleId="DefaultParagraphFont">
     <w:name w:val="Default Paragraph Font"/>
     <w:uiPriority w:val="1"/>
+    <w:semiHidden/>
     <w:unhideWhenUsed/>
   </w:style>
   <w:style w:type="table" w:default="1" w:styleId="TableNormal">

</xml_diff>